<commit_message>
CBTS resume -> 100% (competitive analysis confirmed); add skill to experience_bank
</commit_message>
<xml_diff>
--- a/resumes/CBTS-Product Manager Business.docx
+++ b/resumes/CBTS-Product Manager Business.docx
@@ -78,7 +78,7 @@
           <w:i w:val="0"/>
           <w:sz w:val="19"/>
         </w:rPr>
-        <w:t>Product Manager with 5+ years owning the full product lifecycle — vision, strategy, multi-release roadmap, and business outcomes — across consumer, marketplace, and internal enterprise platform and CRM systems. Grounds decisions in market research, customer discovery, and data; translates goals into PRDs, user stories, and a prioritized backlog; and partners across engineering, design, data, sales, marketing, and finance to ship, launch, and grow. Drives adoption and commercial impact — 20% revenue growth, 25% ARPU expansion, and profitability visibility via a counselor-wise P&amp;L tracker.</w:t>
+        <w:t>Product Manager with 5+ years owning the full product lifecycle — vision, strategy, multi-release roadmap, and business outcomes — across consumer, marketplace, and internal enterprise platform and CRM systems. Grounds decisions in market research, competitive analysis, customer discovery, and data; translates goals into PRDs, user stories, and a prioritized backlog; and partners across engineering, design, data, sales, marketing, and finance to ship, launch, and grow. Drives adoption and commercial impact — 20% revenue growth, 25% ARPU expansion, and profitability visibility via a counselor-wise P&amp;L tracker.</w:t>
       </w:r>
     </w:p>
     <w:p>
@@ -349,7 +349,7 @@
           <w:i w:val="0"/>
           <w:sz w:val="19"/>
         </w:rPr>
-        <w:t>Product Vision, Strategy &amp; Multi-Release Roadmap · Market Research, Customer Discovery &amp; Data Analysis · PRDs, User Stories, Acceptance Criteria &amp; Product Requirements · Backlog Prioritization (Value, Commercial Impact, Feasibility, Risk, Dependencies) · Cross-Functional Delivery (Engineering, Design, Data, Sales, Marketing, Finance) · GTM (Go-to-Market): Launch Readiness, Positioning, Pricing &amp; Sales Enablement · Adoption &amp; Product KPIs (Revenue, Profitability, CSAT, Business Value &amp; Impact) · Product Lifecycle (Discovery → EOL) · Stakeholder Influence &amp; Management · Product Management Standards &amp; Playbooks</w:t>
+        <w:t>Product Vision, Strategy &amp; Multi-Release Roadmap · Market Research, Competitive Analysis, Customer Discovery &amp; Data Analysis · PRDs, User Stories, Acceptance Criteria &amp; Product Requirements · Backlog Prioritization (Value, Commercial Impact, Feasibility, Risk, Dependencies) · Cross-Functional Delivery (Engineering, Design, Data, Sales, Marketing, Finance) · GTM (Go-to-Market): Launch Readiness, Positioning, Pricing &amp; Sales Enablement · Adoption &amp; Product KPIs (Revenue, Profitability, CSAT, Business Value &amp; Impact) · Product Lifecycle (Discovery → EOL) · Stakeholder Influence &amp; Management · Product Management Standards &amp; Playbooks</w:t>
       </w:r>
     </w:p>
     <w:p>

</xml_diff>